<commit_message>
Regenerate report with populated table of contents
</commit_message>
<xml_diff>
--- a/docs/CS4241_Project_Report_10022200118.docx
+++ b/docs/CS4241_Project_Report_10022200118.docx
@@ -294,12 +294,1261 @@
       </w:r>
     </w:p>
     <w:p>
+      <w:pPr>
+        <w:tabs>
+          <w:tab w:pos="9071" w:val="right" w:leader="dot"/>
+        </w:tabs>
+        <w:spacing w:after="40"/>
+        <w:ind w:left="0"/>
+      </w:pPr>
       <w:r>
-        <w:fldChar w:fldCharType="begin"/>
-        <w:instrText xml:space="preserve">TOC \o "1-3" \h \z \u</w:instrText>
-        <w:fldChar w:fldCharType="separate"/>
-        <w:t>Right-click this text in Word and choose 'Update Field' to populate the table of contents.</w:t>
-        <w:fldChar w:fldCharType="end"/>
+        <w:rPr>
+          <w:rFonts w:ascii="Calibri" w:hAnsi="Calibri"/>
+          <w:b/>
+          <w:sz w:val="22"/>
+        </w:rPr>
+        <w:t>1. Introduction</w:t>
+      </w:r>
+      <w:r>
+        <w:rPr>
+          <w:sz w:val="22"/>
+        </w:rPr>
+        <w:tab/>
+        <w:t>6</w:t>
+      </w:r>
+    </w:p>
+    <w:p>
+      <w:pPr>
+        <w:tabs>
+          <w:tab w:pos="9071" w:val="right" w:leader="dot"/>
+        </w:tabs>
+        <w:spacing w:after="40"/>
+        <w:ind w:left="340"/>
+      </w:pPr>
+      <w:r>
+        <w:rPr>
+          <w:rFonts w:ascii="Calibri" w:hAnsi="Calibri"/>
+          <w:sz w:val="20"/>
+        </w:rPr>
+        <w:t>1.1 Problem statement</w:t>
+      </w:r>
+      <w:r>
+        <w:rPr>
+          <w:sz w:val="20"/>
+        </w:rPr>
+        <w:tab/>
+        <w:t>6</w:t>
+      </w:r>
+    </w:p>
+    <w:p>
+      <w:pPr>
+        <w:tabs>
+          <w:tab w:pos="9071" w:val="right" w:leader="dot"/>
+        </w:tabs>
+        <w:spacing w:after="40"/>
+        <w:ind w:left="340"/>
+      </w:pPr>
+      <w:r>
+        <w:rPr>
+          <w:rFonts w:ascii="Calibri" w:hAnsi="Calibri"/>
+          <w:sz w:val="20"/>
+        </w:rPr>
+        <w:t>1.2 Objectives</w:t>
+      </w:r>
+      <w:r>
+        <w:rPr>
+          <w:sz w:val="20"/>
+        </w:rPr>
+        <w:tab/>
+        <w:t>6</w:t>
+      </w:r>
+    </w:p>
+    <w:p>
+      <w:pPr>
+        <w:tabs>
+          <w:tab w:pos="9071" w:val="right" w:leader="dot"/>
+        </w:tabs>
+        <w:spacing w:after="40"/>
+        <w:ind w:left="340"/>
+      </w:pPr>
+      <w:r>
+        <w:rPr>
+          <w:rFonts w:ascii="Calibri" w:hAnsi="Calibri"/>
+          <w:sz w:val="20"/>
+        </w:rPr>
+        <w:t>1.3 Report structure</w:t>
+      </w:r>
+      <w:r>
+        <w:rPr>
+          <w:sz w:val="20"/>
+        </w:rPr>
+        <w:tab/>
+        <w:t>6</w:t>
+      </w:r>
+    </w:p>
+    <w:p>
+      <w:pPr>
+        <w:tabs>
+          <w:tab w:pos="9071" w:val="right" w:leader="dot"/>
+        </w:tabs>
+        <w:spacing w:after="40"/>
+        <w:ind w:left="0"/>
+      </w:pPr>
+      <w:r>
+        <w:rPr>
+          <w:rFonts w:ascii="Calibri" w:hAnsi="Calibri"/>
+          <w:b/>
+          <w:sz w:val="22"/>
+        </w:rPr>
+        <w:t>2. System Architecture (Part F)</w:t>
+      </w:r>
+      <w:r>
+        <w:rPr>
+          <w:sz w:val="22"/>
+        </w:rPr>
+        <w:tab/>
+        <w:t>7</w:t>
+      </w:r>
+    </w:p>
+    <w:p>
+      <w:pPr>
+        <w:tabs>
+          <w:tab w:pos="9071" w:val="right" w:leader="dot"/>
+        </w:tabs>
+        <w:spacing w:after="40"/>
+        <w:ind w:left="340"/>
+      </w:pPr>
+      <w:r>
+        <w:rPr>
+          <w:rFonts w:ascii="Calibri" w:hAnsi="Calibri"/>
+          <w:sz w:val="20"/>
+        </w:rPr>
+        <w:t>2.1 Offline (index-build) data flow</w:t>
+      </w:r>
+      <w:r>
+        <w:rPr>
+          <w:sz w:val="20"/>
+        </w:rPr>
+        <w:tab/>
+        <w:t>7</w:t>
+      </w:r>
+    </w:p>
+    <w:p>
+      <w:pPr>
+        <w:tabs>
+          <w:tab w:pos="9071" w:val="right" w:leader="dot"/>
+        </w:tabs>
+        <w:spacing w:after="40"/>
+        <w:ind w:left="340"/>
+      </w:pPr>
+      <w:r>
+        <w:rPr>
+          <w:rFonts w:ascii="Calibri" w:hAnsi="Calibri"/>
+          <w:sz w:val="20"/>
+        </w:rPr>
+        <w:t>2.2 Online (query-time) data flow</w:t>
+      </w:r>
+      <w:r>
+        <w:rPr>
+          <w:sz w:val="20"/>
+        </w:rPr>
+        <w:tab/>
+        <w:t>7</w:t>
+      </w:r>
+    </w:p>
+    <w:p>
+      <w:pPr>
+        <w:tabs>
+          <w:tab w:pos="9071" w:val="right" w:leader="dot"/>
+        </w:tabs>
+        <w:spacing w:after="40"/>
+        <w:ind w:left="340"/>
+      </w:pPr>
+      <w:r>
+        <w:rPr>
+          <w:rFonts w:ascii="Calibri" w:hAnsi="Calibri"/>
+          <w:sz w:val="20"/>
+        </w:rPr>
+        <w:t>2.3 Component map</w:t>
+      </w:r>
+      <w:r>
+        <w:rPr>
+          <w:sz w:val="20"/>
+        </w:rPr>
+        <w:tab/>
+        <w:t>8</w:t>
+      </w:r>
+    </w:p>
+    <w:p>
+      <w:pPr>
+        <w:tabs>
+          <w:tab w:pos="9071" w:val="right" w:leader="dot"/>
+        </w:tabs>
+        <w:spacing w:after="40"/>
+        <w:ind w:left="340"/>
+      </w:pPr>
+      <w:r>
+        <w:rPr>
+          <w:rFonts w:ascii="Calibri" w:hAnsi="Calibri"/>
+          <w:sz w:val="20"/>
+        </w:rPr>
+        <w:t>2.4 Why this design suits the domain</w:t>
+      </w:r>
+      <w:r>
+        <w:rPr>
+          <w:sz w:val="20"/>
+        </w:rPr>
+        <w:tab/>
+        <w:t>8</w:t>
+      </w:r>
+    </w:p>
+    <w:p>
+      <w:pPr>
+        <w:tabs>
+          <w:tab w:pos="9071" w:val="right" w:leader="dot"/>
+        </w:tabs>
+        <w:spacing w:after="40"/>
+        <w:ind w:left="0"/>
+      </w:pPr>
+      <w:r>
+        <w:rPr>
+          <w:rFonts w:ascii="Calibri" w:hAnsi="Calibri"/>
+          <w:b/>
+          <w:sz w:val="22"/>
+        </w:rPr>
+        <w:t>3. Part A — Data Engineering and Preparation</w:t>
+      </w:r>
+      <w:r>
+        <w:rPr>
+          <w:sz w:val="22"/>
+        </w:rPr>
+        <w:tab/>
+        <w:t>10</w:t>
+      </w:r>
+    </w:p>
+    <w:p>
+      <w:pPr>
+        <w:tabs>
+          <w:tab w:pos="9071" w:val="right" w:leader="dot"/>
+        </w:tabs>
+        <w:spacing w:after="40"/>
+        <w:ind w:left="340"/>
+      </w:pPr>
+      <w:r>
+        <w:rPr>
+          <w:rFonts w:ascii="Calibri" w:hAnsi="Calibri"/>
+          <w:sz w:val="20"/>
+        </w:rPr>
+        <w:t>3.1 Sources</w:t>
+      </w:r>
+      <w:r>
+        <w:rPr>
+          <w:sz w:val="20"/>
+        </w:rPr>
+        <w:tab/>
+        <w:t>10</w:t>
+      </w:r>
+    </w:p>
+    <w:p>
+      <w:pPr>
+        <w:tabs>
+          <w:tab w:pos="9071" w:val="right" w:leader="dot"/>
+        </w:tabs>
+        <w:spacing w:after="40"/>
+        <w:ind w:left="340"/>
+      </w:pPr>
+      <w:r>
+        <w:rPr>
+          <w:rFonts w:ascii="Calibri" w:hAnsi="Calibri"/>
+          <w:sz w:val="20"/>
+        </w:rPr>
+        <w:t>3.2 Cleaning (clean_text)</w:t>
+      </w:r>
+      <w:r>
+        <w:rPr>
+          <w:sz w:val="20"/>
+        </w:rPr>
+        <w:tab/>
+        <w:t>10</w:t>
+      </w:r>
+    </w:p>
+    <w:p>
+      <w:pPr>
+        <w:tabs>
+          <w:tab w:pos="9071" w:val="right" w:leader="dot"/>
+        </w:tabs>
+        <w:spacing w:after="40"/>
+        <w:ind w:left="340"/>
+      </w:pPr>
+      <w:r>
+        <w:rPr>
+          <w:rFonts w:ascii="Calibri" w:hAnsi="Calibri"/>
+          <w:sz w:val="20"/>
+        </w:rPr>
+        <w:t>3.3 Three chunkers, one per situation</w:t>
+      </w:r>
+      <w:r>
+        <w:rPr>
+          <w:sz w:val="20"/>
+        </w:rPr>
+        <w:tab/>
+        <w:t>10</w:t>
+      </w:r>
+    </w:p>
+    <w:p>
+      <w:pPr>
+        <w:tabs>
+          <w:tab w:pos="9071" w:val="right" w:leader="dot"/>
+        </w:tabs>
+        <w:spacing w:after="40"/>
+        <w:ind w:left="340"/>
+      </w:pPr>
+      <w:r>
+        <w:rPr>
+          <w:rFonts w:ascii="Calibri" w:hAnsi="Calibri"/>
+          <w:sz w:val="20"/>
+        </w:rPr>
+        <w:t>3.4 Justification of chunk size (500) and overlap (80)</w:t>
+      </w:r>
+      <w:r>
+        <w:rPr>
+          <w:sz w:val="20"/>
+        </w:rPr>
+        <w:tab/>
+        <w:t>11</w:t>
+      </w:r>
+    </w:p>
+    <w:p>
+      <w:pPr>
+        <w:tabs>
+          <w:tab w:pos="9071" w:val="right" w:leader="dot"/>
+        </w:tabs>
+        <w:spacing w:after="40"/>
+        <w:ind w:left="340"/>
+      </w:pPr>
+      <w:r>
+        <w:rPr>
+          <w:rFonts w:ascii="Calibri" w:hAnsi="Calibri"/>
+          <w:sz w:val="20"/>
+        </w:rPr>
+        <w:t>3.5 Comparative analysis of chunking impact on retrieval quality</w:t>
+      </w:r>
+      <w:r>
+        <w:rPr>
+          <w:sz w:val="20"/>
+        </w:rPr>
+        <w:tab/>
+        <w:t>11</w:t>
+      </w:r>
+    </w:p>
+    <w:p>
+      <w:pPr>
+        <w:tabs>
+          <w:tab w:pos="9071" w:val="right" w:leader="dot"/>
+        </w:tabs>
+        <w:spacing w:after="40"/>
+        <w:ind w:left="0"/>
+      </w:pPr>
+      <w:r>
+        <w:rPr>
+          <w:rFonts w:ascii="Calibri" w:hAnsi="Calibri"/>
+          <w:b/>
+          <w:sz w:val="22"/>
+        </w:rPr>
+        <w:t>4. Part B — Custom Retrieval System</w:t>
+      </w:r>
+      <w:r>
+        <w:rPr>
+          <w:sz w:val="22"/>
+        </w:rPr>
+        <w:tab/>
+        <w:t>13</w:t>
+      </w:r>
+    </w:p>
+    <w:p>
+      <w:pPr>
+        <w:tabs>
+          <w:tab w:pos="9071" w:val="right" w:leader="dot"/>
+        </w:tabs>
+        <w:spacing w:after="40"/>
+        <w:ind w:left="340"/>
+      </w:pPr>
+      <w:r>
+        <w:rPr>
+          <w:rFonts w:ascii="Calibri" w:hAnsi="Calibri"/>
+          <w:sz w:val="20"/>
+        </w:rPr>
+        <w:t>4.1 Embedding pipeline</w:t>
+      </w:r>
+      <w:r>
+        <w:rPr>
+          <w:sz w:val="20"/>
+        </w:rPr>
+        <w:tab/>
+        <w:t>13</w:t>
+      </w:r>
+    </w:p>
+    <w:p>
+      <w:pPr>
+        <w:tabs>
+          <w:tab w:pos="9071" w:val="right" w:leader="dot"/>
+        </w:tabs>
+        <w:spacing w:after="40"/>
+        <w:ind w:left="340"/>
+      </w:pPr>
+      <w:r>
+        <w:rPr>
+          <w:rFonts w:ascii="Calibri" w:hAnsi="Calibri"/>
+          <w:sz w:val="20"/>
+        </w:rPr>
+        <w:t>4.2 Vector storage</w:t>
+      </w:r>
+      <w:r>
+        <w:rPr>
+          <w:sz w:val="20"/>
+        </w:rPr>
+        <w:tab/>
+        <w:t>13</w:t>
+      </w:r>
+    </w:p>
+    <w:p>
+      <w:pPr>
+        <w:tabs>
+          <w:tab w:pos="9071" w:val="right" w:leader="dot"/>
+        </w:tabs>
+        <w:spacing w:after="40"/>
+        <w:ind w:left="340"/>
+      </w:pPr>
+      <w:r>
+        <w:rPr>
+          <w:rFonts w:ascii="Calibri" w:hAnsi="Calibri"/>
+          <w:sz w:val="20"/>
+        </w:rPr>
+        <w:t>4.3 Top-k retrieval and similarity scoring</w:t>
+      </w:r>
+      <w:r>
+        <w:rPr>
+          <w:sz w:val="20"/>
+        </w:rPr>
+        <w:tab/>
+        <w:t>13</w:t>
+      </w:r>
+    </w:p>
+    <w:p>
+      <w:pPr>
+        <w:tabs>
+          <w:tab w:pos="9071" w:val="right" w:leader="dot"/>
+        </w:tabs>
+        <w:spacing w:after="40"/>
+        <w:ind w:left="340"/>
+      </w:pPr>
+      <w:r>
+        <w:rPr>
+          <w:rFonts w:ascii="Calibri" w:hAnsi="Calibri"/>
+          <w:sz w:val="20"/>
+        </w:rPr>
+        <w:t>4.4 Hybrid extension (dense + BM25 + RRF)</w:t>
+      </w:r>
+      <w:r>
+        <w:rPr>
+          <w:sz w:val="20"/>
+        </w:rPr>
+        <w:tab/>
+        <w:t>13</w:t>
+      </w:r>
+    </w:p>
+    <w:p>
+      <w:pPr>
+        <w:tabs>
+          <w:tab w:pos="9071" w:val="right" w:leader="dot"/>
+        </w:tabs>
+        <w:spacing w:after="40"/>
+        <w:ind w:left="340"/>
+      </w:pPr>
+      <w:r>
+        <w:rPr>
+          <w:rFonts w:ascii="Calibri" w:hAnsi="Calibri"/>
+          <w:sz w:val="20"/>
+        </w:rPr>
+        <w:t>4.5 Retrieval ablation study</w:t>
+      </w:r>
+      <w:r>
+        <w:rPr>
+          <w:sz w:val="20"/>
+        </w:rPr>
+        <w:tab/>
+        <w:t>14</w:t>
+      </w:r>
+    </w:p>
+    <w:p>
+      <w:pPr>
+        <w:tabs>
+          <w:tab w:pos="9071" w:val="right" w:leader="dot"/>
+        </w:tabs>
+        <w:spacing w:after="40"/>
+        <w:ind w:left="340"/>
+      </w:pPr>
+      <w:r>
+        <w:rPr>
+          <w:rFonts w:ascii="Calibri" w:hAnsi="Calibri"/>
+          <w:sz w:val="20"/>
+        </w:rPr>
+        <w:t>4.6 Failure cases (critical Part-B task)</w:t>
+      </w:r>
+      <w:r>
+        <w:rPr>
+          <w:sz w:val="20"/>
+        </w:rPr>
+        <w:tab/>
+        <w:t>14</w:t>
+      </w:r>
+    </w:p>
+    <w:p>
+      <w:pPr>
+        <w:tabs>
+          <w:tab w:pos="9071" w:val="right" w:leader="dot"/>
+        </w:tabs>
+        <w:spacing w:after="40"/>
+        <w:ind w:left="340"/>
+      </w:pPr>
+      <w:r>
+        <w:rPr>
+          <w:rFonts w:ascii="Calibri" w:hAnsi="Calibri"/>
+          <w:sz w:val="20"/>
+        </w:rPr>
+        <w:t>4.7 Proposed and implemented fix</w:t>
+      </w:r>
+      <w:r>
+        <w:rPr>
+          <w:sz w:val="20"/>
+        </w:rPr>
+        <w:tab/>
+        <w:t>15</w:t>
+      </w:r>
+    </w:p>
+    <w:p>
+      <w:pPr>
+        <w:tabs>
+          <w:tab w:pos="9071" w:val="right" w:leader="dot"/>
+        </w:tabs>
+        <w:spacing w:after="40"/>
+        <w:ind w:left="340"/>
+      </w:pPr>
+      <w:r>
+        <w:rPr>
+          <w:rFonts w:ascii="Calibri" w:hAnsi="Calibri"/>
+          <w:sz w:val="20"/>
+        </w:rPr>
+        <w:t>4.8 Post-fix verification</w:t>
+      </w:r>
+      <w:r>
+        <w:rPr>
+          <w:sz w:val="20"/>
+        </w:rPr>
+        <w:tab/>
+        <w:t>15</w:t>
+      </w:r>
+    </w:p>
+    <w:p>
+      <w:pPr>
+        <w:tabs>
+          <w:tab w:pos="9071" w:val="right" w:leader="dot"/>
+        </w:tabs>
+        <w:spacing w:after="40"/>
+        <w:ind w:left="0"/>
+      </w:pPr>
+      <w:r>
+        <w:rPr>
+          <w:rFonts w:ascii="Calibri" w:hAnsi="Calibri"/>
+          <w:b/>
+          <w:sz w:val="22"/>
+        </w:rPr>
+        <w:t>5. Part C — Prompt Engineering and Generation</w:t>
+      </w:r>
+      <w:r>
+        <w:rPr>
+          <w:sz w:val="22"/>
+        </w:rPr>
+        <w:tab/>
+        <w:t>16</w:t>
+      </w:r>
+    </w:p>
+    <w:p>
+      <w:pPr>
+        <w:tabs>
+          <w:tab w:pos="9071" w:val="right" w:leader="dot"/>
+        </w:tabs>
+        <w:spacing w:after="40"/>
+        <w:ind w:left="340"/>
+      </w:pPr>
+      <w:r>
+        <w:rPr>
+          <w:rFonts w:ascii="Calibri" w:hAnsi="Calibri"/>
+          <w:sz w:val="20"/>
+        </w:rPr>
+        <w:t>5.1 Three prompt variants</w:t>
+      </w:r>
+      <w:r>
+        <w:rPr>
+          <w:sz w:val="20"/>
+        </w:rPr>
+        <w:tab/>
+        <w:t>16</w:t>
+      </w:r>
+    </w:p>
+    <w:p>
+      <w:pPr>
+        <w:tabs>
+          <w:tab w:pos="9071" w:val="right" w:leader="dot"/>
+        </w:tabs>
+        <w:spacing w:after="40"/>
+        <w:ind w:left="340"/>
+      </w:pPr>
+      <w:r>
+        <w:rPr>
+          <w:rFonts w:ascii="Calibri" w:hAnsi="Calibri"/>
+          <w:sz w:val="20"/>
+        </w:rPr>
+        <w:t>5.2 Context window management</w:t>
+      </w:r>
+      <w:r>
+        <w:rPr>
+          <w:sz w:val="20"/>
+        </w:rPr>
+        <w:tab/>
+        <w:t>16</w:t>
+      </w:r>
+    </w:p>
+    <w:p>
+      <w:pPr>
+        <w:tabs>
+          <w:tab w:pos="9071" w:val="right" w:leader="dot"/>
+        </w:tabs>
+        <w:spacing w:after="40"/>
+        <w:ind w:left="340"/>
+      </w:pPr>
+      <w:r>
+        <w:rPr>
+          <w:rFonts w:ascii="Calibri" w:hAnsi="Calibri"/>
+          <w:sz w:val="20"/>
+        </w:rPr>
+        <w:t>5.3 Evidence of improvement</w:t>
+      </w:r>
+      <w:r>
+        <w:rPr>
+          <w:sz w:val="20"/>
+        </w:rPr>
+        <w:tab/>
+        <w:t>17</w:t>
+      </w:r>
+    </w:p>
+    <w:p>
+      <w:pPr>
+        <w:tabs>
+          <w:tab w:pos="9071" w:val="right" w:leader="dot"/>
+        </w:tabs>
+        <w:spacing w:after="40"/>
+        <w:ind w:left="0"/>
+      </w:pPr>
+      <w:r>
+        <w:rPr>
+          <w:rFonts w:ascii="Calibri" w:hAnsi="Calibri"/>
+          <w:b/>
+          <w:sz w:val="22"/>
+        </w:rPr>
+        <w:t>6. Part D — Full Pipeline with Stage-Level Logging</w:t>
+      </w:r>
+      <w:r>
+        <w:rPr>
+          <w:sz w:val="22"/>
+        </w:rPr>
+        <w:tab/>
+        <w:t>18</w:t>
+      </w:r>
+    </w:p>
+    <w:p>
+      <w:pPr>
+        <w:tabs>
+          <w:tab w:pos="9071" w:val="right" w:leader="dot"/>
+        </w:tabs>
+        <w:spacing w:after="40"/>
+        <w:ind w:left="340"/>
+      </w:pPr>
+      <w:r>
+        <w:rPr>
+          <w:rFonts w:ascii="Calibri" w:hAnsi="Calibri"/>
+          <w:sz w:val="20"/>
+        </w:rPr>
+        <w:t>6.1 Orchestrator</w:t>
+      </w:r>
+      <w:r>
+        <w:rPr>
+          <w:sz w:val="20"/>
+        </w:rPr>
+        <w:tab/>
+        <w:t>18</w:t>
+      </w:r>
+    </w:p>
+    <w:p>
+      <w:pPr>
+        <w:tabs>
+          <w:tab w:pos="9071" w:val="right" w:leader="dot"/>
+        </w:tabs>
+        <w:spacing w:after="40"/>
+        <w:ind w:left="340"/>
+      </w:pPr>
+      <w:r>
+        <w:rPr>
+          <w:rFonts w:ascii="Calibri" w:hAnsi="Calibri"/>
+          <w:sz w:val="20"/>
+        </w:rPr>
+        <w:t>6.2 What is logged at each stage</w:t>
+      </w:r>
+      <w:r>
+        <w:rPr>
+          <w:sz w:val="20"/>
+        </w:rPr>
+        <w:tab/>
+        <w:t>18</w:t>
+      </w:r>
+    </w:p>
+    <w:p>
+      <w:pPr>
+        <w:tabs>
+          <w:tab w:pos="9071" w:val="right" w:leader="dot"/>
+        </w:tabs>
+        <w:spacing w:after="40"/>
+        <w:ind w:left="340"/>
+      </w:pPr>
+      <w:r>
+        <w:rPr>
+          <w:rFonts w:ascii="Calibri" w:hAnsi="Calibri"/>
+          <w:sz w:val="20"/>
+        </w:rPr>
+        <w:t>6.3 Rich response object</w:t>
+      </w:r>
+      <w:r>
+        <w:rPr>
+          <w:sz w:val="20"/>
+        </w:rPr>
+        <w:tab/>
+        <w:t>18</w:t>
+      </w:r>
+    </w:p>
+    <w:p>
+      <w:pPr>
+        <w:tabs>
+          <w:tab w:pos="9071" w:val="right" w:leader="dot"/>
+        </w:tabs>
+        <w:spacing w:after="40"/>
+        <w:ind w:left="340"/>
+      </w:pPr>
+      <w:r>
+        <w:rPr>
+          <w:rFonts w:ascii="Calibri" w:hAnsi="Calibri"/>
+          <w:sz w:val="20"/>
+        </w:rPr>
+        <w:t>6.4 Example log trace</w:t>
+      </w:r>
+      <w:r>
+        <w:rPr>
+          <w:sz w:val="20"/>
+        </w:rPr>
+        <w:tab/>
+        <w:t>19</w:t>
+      </w:r>
+    </w:p>
+    <w:p>
+      <w:pPr>
+        <w:tabs>
+          <w:tab w:pos="9071" w:val="right" w:leader="dot"/>
+        </w:tabs>
+        <w:spacing w:after="40"/>
+        <w:ind w:left="340"/>
+      </w:pPr>
+      <w:r>
+        <w:rPr>
+          <w:rFonts w:ascii="Calibri" w:hAnsi="Calibri"/>
+          <w:sz w:val="20"/>
+        </w:rPr>
+        <w:t>6.5 Resilience</w:t>
+      </w:r>
+      <w:r>
+        <w:rPr>
+          <w:sz w:val="20"/>
+        </w:rPr>
+        <w:tab/>
+        <w:t>19</w:t>
+      </w:r>
+    </w:p>
+    <w:p>
+      <w:pPr>
+        <w:tabs>
+          <w:tab w:pos="9071" w:val="right" w:leader="dot"/>
+        </w:tabs>
+        <w:spacing w:after="40"/>
+        <w:ind w:left="0"/>
+      </w:pPr>
+      <w:r>
+        <w:rPr>
+          <w:rFonts w:ascii="Calibri" w:hAnsi="Calibri"/>
+          <w:b/>
+          <w:sz w:val="22"/>
+        </w:rPr>
+        <w:t>7. Part E — Critical Evaluation and Adversarial Testing</w:t>
+      </w:r>
+      <w:r>
+        <w:rPr>
+          <w:sz w:val="22"/>
+        </w:rPr>
+        <w:tab/>
+        <w:t>20</w:t>
+      </w:r>
+    </w:p>
+    <w:p>
+      <w:pPr>
+        <w:tabs>
+          <w:tab w:pos="9071" w:val="right" w:leader="dot"/>
+        </w:tabs>
+        <w:spacing w:after="40"/>
+        <w:ind w:left="340"/>
+      </w:pPr>
+      <w:r>
+        <w:rPr>
+          <w:rFonts w:ascii="Calibri" w:hAnsi="Calibri"/>
+          <w:sz w:val="20"/>
+        </w:rPr>
+        <w:t>7.1 Adversarial query design</w:t>
+      </w:r>
+      <w:r>
+        <w:rPr>
+          <w:sz w:val="20"/>
+        </w:rPr>
+        <w:tab/>
+        <w:t>20</w:t>
+      </w:r>
+    </w:p>
+    <w:p>
+      <w:pPr>
+        <w:tabs>
+          <w:tab w:pos="9071" w:val="right" w:leader="dot"/>
+        </w:tabs>
+        <w:spacing w:after="40"/>
+        <w:ind w:left="340"/>
+      </w:pPr>
+      <w:r>
+        <w:rPr>
+          <w:rFonts w:ascii="Calibri" w:hAnsi="Calibri"/>
+          <w:sz w:val="20"/>
+        </w:rPr>
+        <w:t>7.2 Metrics (all computed programmatically)</w:t>
+      </w:r>
+      <w:r>
+        <w:rPr>
+          <w:sz w:val="20"/>
+        </w:rPr>
+        <w:tab/>
+        <w:t>20</w:t>
+      </w:r>
+    </w:p>
+    <w:p>
+      <w:pPr>
+        <w:tabs>
+          <w:tab w:pos="9071" w:val="right" w:leader="dot"/>
+        </w:tabs>
+        <w:spacing w:after="40"/>
+        <w:ind w:left="340"/>
+      </w:pPr>
+      <w:r>
+        <w:rPr>
+          <w:rFonts w:ascii="Calibri" w:hAnsi="Calibri"/>
+          <w:sz w:val="20"/>
+        </w:rPr>
+        <w:t>7.3 RAG vs Pure-LLM comparison</w:t>
+      </w:r>
+      <w:r>
+        <w:rPr>
+          <w:sz w:val="20"/>
+        </w:rPr>
+        <w:tab/>
+        <w:t>20</w:t>
+      </w:r>
+    </w:p>
+    <w:p>
+      <w:pPr>
+        <w:tabs>
+          <w:tab w:pos="9071" w:val="right" w:leader="dot"/>
+        </w:tabs>
+        <w:spacing w:after="40"/>
+        <w:ind w:left="340"/>
+      </w:pPr>
+      <w:r>
+        <w:rPr>
+          <w:rFonts w:ascii="Calibri" w:hAnsi="Calibri"/>
+          <w:sz w:val="20"/>
+        </w:rPr>
+        <w:t>7.4 Aggregate results (live run)</w:t>
+      </w:r>
+      <w:r>
+        <w:rPr>
+          <w:sz w:val="20"/>
+        </w:rPr>
+        <w:tab/>
+        <w:t>21</w:t>
+      </w:r>
+    </w:p>
+    <w:p>
+      <w:pPr>
+        <w:tabs>
+          <w:tab w:pos="9071" w:val="right" w:leader="dot"/>
+        </w:tabs>
+        <w:spacing w:after="40"/>
+        <w:ind w:left="340"/>
+      </w:pPr>
+      <w:r>
+        <w:rPr>
+          <w:rFonts w:ascii="Calibri" w:hAnsi="Calibri"/>
+          <w:sz w:val="20"/>
+        </w:rPr>
+        <w:t>7.5 Follow-up items surfaced by this evaluation</w:t>
+      </w:r>
+      <w:r>
+        <w:rPr>
+          <w:sz w:val="20"/>
+        </w:rPr>
+        <w:tab/>
+        <w:t>21</w:t>
+      </w:r>
+    </w:p>
+    <w:p>
+      <w:pPr>
+        <w:tabs>
+          <w:tab w:pos="9071" w:val="right" w:leader="dot"/>
+        </w:tabs>
+        <w:spacing w:after="40"/>
+        <w:ind w:left="340"/>
+      </w:pPr>
+      <w:r>
+        <w:rPr>
+          <w:rFonts w:ascii="Calibri" w:hAnsi="Calibri"/>
+          <w:sz w:val="20"/>
+        </w:rPr>
+        <w:t>7.6 Threats to validity</w:t>
+      </w:r>
+      <w:r>
+        <w:rPr>
+          <w:sz w:val="20"/>
+        </w:rPr>
+        <w:tab/>
+        <w:t>22</w:t>
+      </w:r>
+    </w:p>
+    <w:p>
+      <w:pPr>
+        <w:tabs>
+          <w:tab w:pos="9071" w:val="right" w:leader="dot"/>
+        </w:tabs>
+        <w:spacing w:after="40"/>
+        <w:ind w:left="0"/>
+      </w:pPr>
+      <w:r>
+        <w:rPr>
+          <w:rFonts w:ascii="Calibri" w:hAnsi="Calibri"/>
+          <w:b/>
+          <w:sz w:val="22"/>
+        </w:rPr>
+        <w:t>8. Part G — Innovation Component</w:t>
+      </w:r>
+      <w:r>
+        <w:rPr>
+          <w:sz w:val="22"/>
+        </w:rPr>
+        <w:tab/>
+        <w:t>23</w:t>
+      </w:r>
+    </w:p>
+    <w:p>
+      <w:pPr>
+        <w:tabs>
+          <w:tab w:pos="9071" w:val="right" w:leader="dot"/>
+        </w:tabs>
+        <w:spacing w:after="40"/>
+        <w:ind w:left="340"/>
+      </w:pPr>
+      <w:r>
+        <w:rPr>
+          <w:rFonts w:ascii="Calibri" w:hAnsi="Calibri"/>
+          <w:sz w:val="20"/>
+        </w:rPr>
+        <w:t>8.1 Two complementary novel features</w:t>
+      </w:r>
+      <w:r>
+        <w:rPr>
+          <w:sz w:val="20"/>
+        </w:rPr>
+        <w:tab/>
+        <w:t>23</w:t>
+      </w:r>
+    </w:p>
+    <w:p>
+      <w:pPr>
+        <w:tabs>
+          <w:tab w:pos="9071" w:val="right" w:leader="dot"/>
+        </w:tabs>
+        <w:spacing w:after="40"/>
+        <w:ind w:left="340"/>
+      </w:pPr>
+      <w:r>
+        <w:rPr>
+          <w:rFonts w:ascii="Calibri" w:hAnsi="Calibri"/>
+          <w:sz w:val="20"/>
+        </w:rPr>
+        <w:t>8.2 Domain-specific scoring function</w:t>
+      </w:r>
+      <w:r>
+        <w:rPr>
+          <w:sz w:val="20"/>
+        </w:rPr>
+        <w:tab/>
+        <w:t>23</w:t>
+      </w:r>
+    </w:p>
+    <w:p>
+      <w:pPr>
+        <w:tabs>
+          <w:tab w:pos="9071" w:val="right" w:leader="dot"/>
+        </w:tabs>
+        <w:spacing w:after="40"/>
+        <w:ind w:left="340"/>
+      </w:pPr>
+      <w:r>
+        <w:rPr>
+          <w:rFonts w:ascii="Calibri" w:hAnsi="Calibri"/>
+          <w:sz w:val="20"/>
+        </w:rPr>
+        <w:t>8.3 Feedback loop for improving retrieval</w:t>
+      </w:r>
+      <w:r>
+        <w:rPr>
+          <w:sz w:val="20"/>
+        </w:rPr>
+        <w:tab/>
+        <w:t>23</w:t>
+      </w:r>
+    </w:p>
+    <w:p>
+      <w:pPr>
+        <w:tabs>
+          <w:tab w:pos="9071" w:val="right" w:leader="dot"/>
+        </w:tabs>
+        <w:spacing w:after="40"/>
+        <w:ind w:left="340"/>
+      </w:pPr>
+      <w:r>
+        <w:rPr>
+          <w:rFonts w:ascii="Calibri" w:hAnsi="Calibri"/>
+          <w:sz w:val="20"/>
+        </w:rPr>
+        <w:t>8.4 Why these features suit the domain</w:t>
+      </w:r>
+      <w:r>
+        <w:rPr>
+          <w:sz w:val="20"/>
+        </w:rPr>
+        <w:tab/>
+        <w:t>23</w:t>
+      </w:r>
+    </w:p>
+    <w:p>
+      <w:pPr>
+        <w:tabs>
+          <w:tab w:pos="9071" w:val="right" w:leader="dot"/>
+        </w:tabs>
+        <w:spacing w:after="40"/>
+        <w:ind w:left="0"/>
+      </w:pPr>
+      <w:r>
+        <w:rPr>
+          <w:rFonts w:ascii="Calibri" w:hAnsi="Calibri"/>
+          <w:b/>
+          <w:sz w:val="22"/>
+        </w:rPr>
+        <w:t>9. Application — Streamlit UI (Final Deliverable i)</w:t>
+      </w:r>
+      <w:r>
+        <w:rPr>
+          <w:sz w:val="22"/>
+        </w:rPr>
+        <w:tab/>
+        <w:t>25</w:t>
+      </w:r>
+    </w:p>
+    <w:p>
+      <w:pPr>
+        <w:tabs>
+          <w:tab w:pos="9071" w:val="right" w:leader="dot"/>
+        </w:tabs>
+        <w:spacing w:after="40"/>
+        <w:ind w:left="0"/>
+      </w:pPr>
+      <w:r>
+        <w:rPr>
+          <w:rFonts w:ascii="Calibri" w:hAnsi="Calibri"/>
+          <w:b/>
+          <w:sz w:val="22"/>
+        </w:rPr>
+        <w:t>10. Deployment</w:t>
+      </w:r>
+      <w:r>
+        <w:rPr>
+          <w:sz w:val="22"/>
+        </w:rPr>
+        <w:tab/>
+        <w:t>26</w:t>
+      </w:r>
+    </w:p>
+    <w:p>
+      <w:pPr>
+        <w:tabs>
+          <w:tab w:pos="9071" w:val="right" w:leader="dot"/>
+        </w:tabs>
+        <w:spacing w:after="40"/>
+        <w:ind w:left="0"/>
+      </w:pPr>
+      <w:r>
+        <w:rPr>
+          <w:rFonts w:ascii="Calibri" w:hAnsi="Calibri"/>
+          <w:b/>
+          <w:sz w:val="22"/>
+        </w:rPr>
+        <w:t>11. Constraint Compliance</w:t>
+      </w:r>
+      <w:r>
+        <w:rPr>
+          <w:sz w:val="22"/>
+        </w:rPr>
+        <w:tab/>
+        <w:t>27</w:t>
+      </w:r>
+    </w:p>
+    <w:p>
+      <w:pPr>
+        <w:tabs>
+          <w:tab w:pos="9071" w:val="right" w:leader="dot"/>
+        </w:tabs>
+        <w:spacing w:after="40"/>
+        <w:ind w:left="0"/>
+      </w:pPr>
+      <w:r>
+        <w:rPr>
+          <w:rFonts w:ascii="Calibri" w:hAnsi="Calibri"/>
+          <w:b/>
+          <w:sz w:val="22"/>
+        </w:rPr>
+        <w:t>12. Lessons Learned and Reflections</w:t>
+      </w:r>
+      <w:r>
+        <w:rPr>
+          <w:sz w:val="22"/>
+        </w:rPr>
+        <w:tab/>
+        <w:t>28</w:t>
+      </w:r>
+    </w:p>
+    <w:p>
+      <w:pPr>
+        <w:tabs>
+          <w:tab w:pos="9071" w:val="right" w:leader="dot"/>
+        </w:tabs>
+        <w:spacing w:after="40"/>
+        <w:ind w:left="0"/>
+      </w:pPr>
+      <w:r>
+        <w:rPr>
+          <w:rFonts w:ascii="Calibri" w:hAnsi="Calibri"/>
+          <w:b/>
+          <w:sz w:val="22"/>
+        </w:rPr>
+        <w:t>Appendix A. File-to-Exam-Part Map</w:t>
+      </w:r>
+      <w:r>
+        <w:rPr>
+          <w:sz w:val="22"/>
+        </w:rPr>
+        <w:tab/>
+        <w:t>29</w:t>
+      </w:r>
+    </w:p>
+    <w:p>
+      <w:pPr>
+        <w:tabs>
+          <w:tab w:pos="9071" w:val="right" w:leader="dot"/>
+        </w:tabs>
+        <w:spacing w:after="40"/>
+        <w:ind w:left="0"/>
+      </w:pPr>
+      <w:r>
+        <w:rPr>
+          <w:rFonts w:ascii="Calibri" w:hAnsi="Calibri"/>
+          <w:b/>
+          <w:sz w:val="22"/>
+        </w:rPr>
+        <w:t>Appendix B. Key Configuration Parameters</w:t>
+      </w:r>
+      <w:r>
+        <w:rPr>
+          <w:sz w:val="22"/>
+        </w:rPr>
+        <w:tab/>
+        <w:t>30</w:t>
+      </w:r>
+    </w:p>
+    <w:p>
+      <w:pPr>
+        <w:tabs>
+          <w:tab w:pos="9071" w:val="right" w:leader="dot"/>
+        </w:tabs>
+        <w:spacing w:after="40"/>
+        <w:ind w:left="0"/>
+      </w:pPr>
+      <w:r>
+        <w:rPr>
+          <w:rFonts w:ascii="Calibri" w:hAnsi="Calibri"/>
+          <w:b/>
+          <w:sz w:val="22"/>
+        </w:rPr>
+        <w:t>Appendix C. Full Adversarial Query Set</w:t>
+      </w:r>
+      <w:r>
+        <w:rPr>
+          <w:sz w:val="22"/>
+        </w:rPr>
+        <w:tab/>
+        <w:t>31</w:t>
+      </w:r>
+    </w:p>
+    <w:p>
+      <w:pPr>
+        <w:tabs>
+          <w:tab w:pos="9071" w:val="right" w:leader="dot"/>
+        </w:tabs>
+        <w:spacing w:after="40"/>
+        <w:ind w:left="0"/>
+      </w:pPr>
+      <w:r>
+        <w:rPr>
+          <w:rFonts w:ascii="Calibri" w:hAnsi="Calibri"/>
+          <w:b/>
+          <w:sz w:val="22"/>
+        </w:rPr>
+        <w:t>Appendix D. Submission Checklist</w:t>
+      </w:r>
+      <w:r>
+        <w:rPr>
+          <w:sz w:val="22"/>
+        </w:rPr>
+        <w:tab/>
+        <w:t>32</w:t>
       </w:r>
     </w:p>
     <w:p>
@@ -7037,7 +8286,7 @@
               <w:rPr>
                 <w:sz w:val="20"/>
               </w:rPr>
-              <w:t>≈ 1 sentence carry-over</w:t>
+              <w:t>approx 1 sentence carry-over</w:t>
             </w:r>
           </w:p>
         </w:tc>
@@ -7619,7 +8868,7 @@
               <w:rPr>
                 <w:sz w:val="20"/>
               </w:rPr>
-              <w:t>—</w:t>
+              <w:t>-</w:t>
             </w:r>
           </w:p>
         </w:tc>
@@ -7691,7 +8940,7 @@
               <w:rPr>
                 <w:sz w:val="20"/>
               </w:rPr>
-              <w:t>—</w:t>
+              <w:t>-</w:t>
             </w:r>
           </w:p>
         </w:tc>
@@ -7911,7 +9160,7 @@
         <w:pStyle w:val="ListNumber"/>
       </w:pPr>
       <w:r>
-        <w:t>Video walkthrough link (≤ 2 minutes, YouTube Unlisted is acceptable).</w:t>
+        <w:t>Video walkthrough link (&lt;= 2 minutes, YouTube Unlisted is acceptable).</w:t>
       </w:r>
     </w:p>
     <w:p>

</xml_diff>